<commit_message>
Updating images and poster.
</commit_message>
<xml_diff>
--- a/poster/USRSE26_abstract.docx
+++ b/poster/USRSE26_abstract.docx
@@ -92,7 +92,7 @@
         <w:pStyle w:val="FirstParagraph"/>
       </w:pPr>
       <w:r>
-        <w:t xml:space="preserve">research software engineering; AI agents for scientific computing; PETSc; partial differential equations; magnetically confined fusion; verification and validation</w:t>
+        <w:t xml:space="preserve">research software engineering; AI agents for scientific computing; PETSc; partial differential equations; magnetically confined fusion; shaped tokamak equilibria; safety factor; verification and validation</w:t>
       </w:r>
     </w:p>
     <w:bookmarkEnd w:id="24"/>
@@ -738,6 +738,283 @@
       </w:r>
       <w:r>
         <w:t xml:space="preserve">.</w:t>
+      </w:r>
+    </w:p>
+    <w:p>
+      <w:pPr>
+        <w:pStyle w:val="BodyText"/>
+      </w:pPr>
+      <w:r>
+        <w:t xml:space="preserve">We then drove the same pipeline into a</w:t>
+      </w:r>
+      <w:r>
+        <w:t xml:space="preserve"> </w:t>
+      </w:r>
+      <w:r>
+        <w:rPr>
+          <w:bCs/>
+          <w:b/>
+        </w:rPr>
+        <w:t xml:space="preserve">shaped, real-machine</w:t>
+      </w:r>
+      <w:r>
+        <w:t xml:space="preserve"> </w:t>
+      </w:r>
+      <w:r>
+        <w:t xml:space="preserve">regime. Using the analytic</w:t>
+      </w:r>
+      <w:r>
+        <w:t xml:space="preserve"> </w:t>
+      </w:r>
+      <w:r>
+        <w:rPr>
+          <w:bCs/>
+          <w:b/>
+        </w:rPr>
+        <w:t xml:space="preserve">Cerfon–Freidberg</w:t>
+      </w:r>
+      <w:r>
+        <w:rPr>
+          <w:bCs/>
+          <w:b/>
+        </w:rPr>
+        <w:t xml:space="preserve"> </w:t>
+      </w:r>
+      <w:r>
+        <w:rPr>
+          <w:bCs/>
+          <w:b/>
+        </w:rPr>
+        <w:t xml:space="preserve">“</w:t>
+      </w:r>
+      <w:r>
+        <w:rPr>
+          <w:bCs/>
+          <w:b/>
+        </w:rPr>
+        <w:t xml:space="preserve">one size fits all</w:t>
+      </w:r>
+      <w:r>
+        <w:rPr>
+          <w:bCs/>
+          <w:b/>
+        </w:rPr>
+        <w:t xml:space="preserve">”</w:t>
+      </w:r>
+      <w:r>
+        <w:rPr>
+          <w:bCs/>
+          <w:b/>
+        </w:rPr>
+        <w:t xml:space="preserve"> </w:t>
+      </w:r>
+      <w:r>
+        <w:rPr>
+          <w:bCs/>
+          <w:b/>
+        </w:rPr>
+        <w:t xml:space="preserve">Solov’ev</w:t>
+      </w:r>
+      <w:r>
+        <w:t xml:space="preserve"> </w:t>
+      </w:r>
+      <w:r>
+        <w:t xml:space="preserve">solution as an exact benchmark, a single</w:t>
+      </w:r>
+      <w:r>
+        <w:t xml:space="preserve"> </w:t>
+      </w:r>
+      <w:r>
+        <w:t xml:space="preserve">agent-generated, parameterized PETSc solver reproduces</w:t>
+      </w:r>
+      <w:r>
+        <w:t xml:space="preserve"> </w:t>
+      </w:r>
+      <w:r>
+        <w:rPr>
+          <w:bCs/>
+          <w:b/>
+        </w:rPr>
+        <w:t xml:space="preserve">three physically shaped equilibria</w:t>
+      </w:r>
+      <w:r>
+        <w:t xml:space="preserve"> </w:t>
+      </w:r>
+      <w:r>
+        <w:t xml:space="preserve">—</w:t>
+      </w:r>
+      <w:r>
+        <w:t xml:space="preserve"> </w:t>
+      </w:r>
+      <w:r>
+        <w:t xml:space="preserve">an</w:t>
+      </w:r>
+      <w:r>
+        <w:t xml:space="preserve"> </w:t>
+      </w:r>
+      <w:r>
+        <w:rPr>
+          <w:bCs/>
+          <w:b/>
+        </w:rPr>
+        <w:t xml:space="preserve">ITER-like D-shape</w:t>
+      </w:r>
+      <w:r>
+        <w:t xml:space="preserve">, a</w:t>
+      </w:r>
+      <w:r>
+        <w:t xml:space="preserve"> </w:t>
+      </w:r>
+      <w:r>
+        <w:rPr>
+          <w:bCs/>
+          <w:b/>
+        </w:rPr>
+        <w:t xml:space="preserve">spherical-tokamak (NSTX-like)</w:t>
+      </w:r>
+      <w:r>
+        <w:t xml:space="preserve"> </w:t>
+      </w:r>
+      <w:r>
+        <w:t xml:space="preserve">plasma, and a</w:t>
+      </w:r>
+      <w:r>
+        <w:t xml:space="preserve"> </w:t>
+      </w:r>
+      <w:r>
+        <w:rPr>
+          <w:bCs/>
+          <w:b/>
+        </w:rPr>
+        <w:t xml:space="preserve">diverted</w:t>
+      </w:r>
+      <w:r>
+        <w:rPr>
+          <w:bCs/>
+          <w:b/>
+        </w:rPr>
+        <w:t xml:space="preserve"> </w:t>
+      </w:r>
+      <w:r>
+        <w:rPr>
+          <w:bCs/>
+          <w:b/>
+        </w:rPr>
+        <w:t xml:space="preserve">double-null with magnetic X-points</w:t>
+      </w:r>
+      <w:r>
+        <w:t xml:space="preserve"> </w:t>
+      </w:r>
+      <w:r>
+        <w:t xml:space="preserve">— set by the inverse aspect ratio, elongation, and</w:t>
+      </w:r>
+      <w:r>
+        <w:t xml:space="preserve"> </w:t>
+      </w:r>
+      <w:r>
+        <w:t xml:space="preserve">triangularity. Each case is</w:t>
+      </w:r>
+      <w:r>
+        <w:t xml:space="preserve"> </w:t>
+      </w:r>
+      <w:r>
+        <w:rPr>
+          <w:bCs/>
+          <w:b/>
+        </w:rPr>
+        <w:t xml:space="preserve">verified at second order (p = 2.00)</w:t>
+      </w:r>
+      <w:r>
+        <w:t xml:space="preserve"> </w:t>
+      </w:r>
+      <w:r>
+        <w:t xml:space="preserve">against the analytic</w:t>
+      </w:r>
+      <w:r>
+        <w:t xml:space="preserve"> </w:t>
+      </w:r>
+      <w:r>
+        <w:t xml:space="preserve">solution and runs on 1 and 4 MPI ranks with no human edits. We compute the</w:t>
+      </w:r>
+      <w:r>
+        <w:t xml:space="preserve"> </w:t>
+      </w:r>
+      <w:r>
+        <w:rPr>
+          <w:bCs/>
+          <w:b/>
+        </w:rPr>
+        <w:t xml:space="preserve">safety-factor</w:t>
+      </w:r>
+      <w:r>
+        <w:rPr>
+          <w:bCs/>
+          <w:b/>
+        </w:rPr>
+        <w:t xml:space="preserve"> </w:t>
+      </w:r>
+      <w:r>
+        <w:rPr>
+          <w:bCs/>
+          <w:b/>
+        </w:rPr>
+        <w:t xml:space="preserve">profile q(ψ)</w:t>
+      </w:r>
+      <w:r>
+        <w:t xml:space="preserve"> </w:t>
+      </w:r>
+      <w:r>
+        <w:t xml:space="preserve">of each verified equilibrium and cross-check it against the independent</w:t>
+      </w:r>
+      <w:r>
+        <w:t xml:space="preserve"> </w:t>
+      </w:r>
+      <w:r>
+        <w:rPr>
+          <w:bCs/>
+          <w:b/>
+        </w:rPr>
+        <w:t xml:space="preserve">FreeGS</w:t>
+      </w:r>
+      <w:r>
+        <w:t xml:space="preserve"> </w:t>
+      </w:r>
+      <w:r>
+        <w:t xml:space="preserve">equilibrium code, obtaining agreement to</w:t>
+      </w:r>
+      <w:r>
+        <w:t xml:space="preserve"> </w:t>
+      </w:r>
+      <w:r>
+        <w:rPr>
+          <w:bCs/>
+          <w:b/>
+        </w:rPr>
+        <w:t xml:space="preserve">better than 0.2%</w:t>
+      </w:r>
+      <w:r>
+        <w:t xml:space="preserve"> </w:t>
+      </w:r>
+      <w:r>
+        <w:t xml:space="preserve">on identical fields,</w:t>
+      </w:r>
+      <w:r>
+        <w:t xml:space="preserve"> </w:t>
+      </w:r>
+      <w:r>
+        <w:t xml:space="preserve">with the recovered elongation and triangularity matching the targets to ~1–2%. This shows the</w:t>
+      </w:r>
+      <w:r>
+        <w:t xml:space="preserve"> </w:t>
+      </w:r>
+      <w:r>
+        <w:t xml:space="preserve">workflow scales from a toy verification anchor to trustworthy, real-machine-shaped equilibria</w:t>
+      </w:r>
+      <w:r>
+        <w:t xml:space="preserve"> </w:t>
+      </w:r>
+      <w:r>
+        <w:t xml:space="preserve">without changing the generated solver’s structure.</w:t>
       </w:r>
     </w:p>
     <w:p>

</xml_diff>